<commit_message>
pushing assignment 1_3 06/14/2026
</commit_message>
<xml_diff>
--- a/module-1/Flamholtz-Assignment1_2.docx
+++ b/module-1/Flamholtz-Assignment1_2.docx
@@ -3,14 +3,72 @@
 <w:document xmlns:wpc="http://schemas.microsoft.com/office/word/2010/wordprocessingCanvas" xmlns:cx="http://schemas.microsoft.com/office/drawing/2014/chartex" xmlns:cx1="http://schemas.microsoft.com/office/drawing/2015/9/8/chartex" xmlns:cx2="http://schemas.microsoft.com/office/drawing/2015/10/21/chartex" xmlns:cx3="http://schemas.microsoft.com/office/drawing/2016/5/9/chartex" xmlns:cx4="http://schemas.microsoft.com/office/drawing/2016/5/10/chartex" xmlns:cx5="http://schemas.microsoft.com/office/drawing/2016/5/11/chartex" xmlns:cx6="http://schemas.microsoft.com/office/drawing/2016/5/12/chartex" xmlns:cx7="http://schemas.microsoft.com/office/drawing/2016/5/13/chartex" xmlns:cx8="http://schemas.microsoft.com/office/drawing/2016/5/14/chartex" xmlns:mc="http://schemas.openxmlformats.org/markup-compatibility/2006" xmlns:aink="http://schemas.microsoft.com/office/drawing/2016/ink" xmlns:am3d="http://schemas.microsoft.com/office/drawing/2017/model3d" xmlns:o="urn:schemas-microsoft-com:office:office" xmlns:oel="http://schemas.microsoft.com/office/2019/extlst" xmlns:r="http://schemas.openxmlformats.org/officeDocument/2006/relationships" xmlns:m="http://schemas.openxmlformats.org/officeDocument/2006/math" xmlns:v="urn:schemas-microsoft-com:vml" xmlns:wp14="http://schemas.microsoft.com/office/word/2010/wordprocessingDrawing" xmlns:wp="http://schemas.openxmlformats.org/drawingml/2006/wordprocessingDrawing" xmlns:w10="urn:schemas-microsoft-com:office:word" xmlns:w="http://schemas.openxmlformats.org/wordprocessingml/2006/main" xmlns:w14="http://schemas.microsoft.com/office/word/2010/wordml" xmlns:w15="http://schemas.microsoft.com/office/word/2012/wordml" xmlns:w16cex="http://schemas.microsoft.com/office/word/2018/wordml/cex" xmlns:w16cid="http://schemas.microsoft.com/office/word/2016/wordml/cid" xmlns:w16="http://schemas.microsoft.com/office/word/2018/wordml" xmlns:w16du="http://schemas.microsoft.com/office/word/2023/wordml/word16du" xmlns:w16sdtdh="http://schemas.microsoft.com/office/word/2020/wordml/sdtdatahash" xmlns:w16sdtfl="http://schemas.microsoft.com/office/word/2024/wordml/sdtformatlock" xmlns:w16se="http://schemas.microsoft.com/office/word/2015/wordml/symex" xmlns:wpg="http://schemas.microsoft.com/office/word/2010/wordprocessingGroup" xmlns:wpi="http://schemas.microsoft.com/office/word/2010/wordprocessingInk" xmlns:wne="http://schemas.microsoft.com/office/word/2006/wordml" xmlns:wps="http://schemas.microsoft.com/office/word/2010/wordprocessingShape" mc:Ignorable="w14 w15 w16se w16cid w16 w16cex w16sdtdh w16sdtfl w16du wp14">
   <w:body>
     <w:p>
+      <w:pPr>
+        <w:rPr>
+          <w:noProof/>
+        </w:rPr>
+      </w:pPr>
       <w:r>
         <w:rPr>
           <w:noProof/>
         </w:rPr>
         <w:drawing>
-          <wp:inline distT="0" distB="0" distL="0" distR="0" wp14:anchorId="2A64320C" wp14:editId="201BFA47">
-            <wp:extent cx="5808345" cy="4727575"/>
-            <wp:effectExtent l="0" t="0" r="1905" b="0"/>
+          <wp:inline distT="0" distB="0" distL="0" distR="0" wp14:anchorId="76C361A7" wp14:editId="1ECDD5D3">
+            <wp:extent cx="4833938" cy="1613895"/>
+            <wp:effectExtent l="0" t="0" r="5080" b="5715"/>
+            <wp:docPr id="1285566909" name="Picture 1"/>
+            <wp:cNvGraphicFramePr>
+              <a:graphicFrameLocks xmlns:a="http://schemas.openxmlformats.org/drawingml/2006/main" noChangeAspect="1"/>
+            </wp:cNvGraphicFramePr>
+            <a:graphic xmlns:a="http://schemas.openxmlformats.org/drawingml/2006/main">
+              <a:graphicData uri="http://schemas.openxmlformats.org/drawingml/2006/picture">
+                <pic:pic xmlns:pic="http://schemas.openxmlformats.org/drawingml/2006/picture">
+                  <pic:nvPicPr>
+                    <pic:cNvPr id="0" name="Picture 1"/>
+                    <pic:cNvPicPr>
+                      <a:picLocks noChangeAspect="1" noChangeArrowheads="1"/>
+                    </pic:cNvPicPr>
+                  </pic:nvPicPr>
+                  <pic:blipFill>
+                    <a:blip r:embed="rId6" cstate="print">
+                      <a:extLst>
+                        <a:ext uri="{28A0092B-C50C-407E-A947-70E740481C1C}">
+                          <a14:useLocalDpi xmlns:a14="http://schemas.microsoft.com/office/drawing/2010/main" val="0"/>
+                        </a:ext>
+                      </a:extLst>
+                    </a:blip>
+                    <a:srcRect/>
+                    <a:stretch>
+                      <a:fillRect/>
+                    </a:stretch>
+                  </pic:blipFill>
+                  <pic:spPr bwMode="auto">
+                    <a:xfrm>
+                      <a:off x="0" y="0"/>
+                      <a:ext cx="4847956" cy="1618575"/>
+                    </a:xfrm>
+                    <a:prstGeom prst="rect">
+                      <a:avLst/>
+                    </a:prstGeom>
+                    <a:noFill/>
+                    <a:ln>
+                      <a:noFill/>
+                    </a:ln>
+                  </pic:spPr>
+                </pic:pic>
+              </a:graphicData>
+            </a:graphic>
+          </wp:inline>
+        </w:drawing>
+      </w:r>
+      <w:r>
+        <w:rPr>
+          <w:noProof/>
+        </w:rPr>
+        <w:drawing>
+          <wp:inline distT="0" distB="0" distL="0" distR="0" wp14:anchorId="2A64320C" wp14:editId="5F857B08">
+            <wp:extent cx="4967288" cy="4043015"/>
+            <wp:effectExtent l="0" t="0" r="5080" b="0"/>
             <wp:docPr id="1531333197" name="Picture 1"/>
             <wp:cNvGraphicFramePr>
               <a:graphicFrameLocks xmlns:a="http://schemas.openxmlformats.org/drawingml/2006/main" noChangeAspect="1"/>
@@ -25,7 +83,7 @@
                     </pic:cNvPicPr>
                   </pic:nvPicPr>
                   <pic:blipFill>
-                    <a:blip r:embed="rId6">
+                    <a:blip r:embed="rId7" cstate="print">
                       <a:extLst>
                         <a:ext uri="{28A0092B-C50C-407E-A947-70E740481C1C}">
                           <a14:useLocalDpi xmlns:a14="http://schemas.microsoft.com/office/drawing/2010/main" val="0"/>
@@ -40,7 +98,7 @@
                   <pic:spPr bwMode="auto">
                     <a:xfrm>
                       <a:off x="0" y="0"/>
-                      <a:ext cx="5808345" cy="4727575"/>
+                      <a:ext cx="4973699" cy="4048233"/>
                     </a:xfrm>
                     <a:prstGeom prst="rect">
                       <a:avLst/>
@@ -57,8 +115,20 @@
         </w:drawing>
       </w:r>
     </w:p>
+    <w:p>
+      <w:pPr>
+        <w:rPr>
+          <w:noProof/>
+        </w:rPr>
+      </w:pPr>
+    </w:p>
+    <w:p>
+      <w:r>
+        <w:t>https://github.com/tflamholtz/csd-325.git</w:t>
+      </w:r>
+    </w:p>
     <w:sectPr>
-      <w:headerReference w:type="default" r:id="rId7"/>
+      <w:headerReference w:type="default" r:id="rId8"/>
       <w:pgSz w:w="12240" w:h="15840"/>
       <w:pgMar w:top="1440" w:right="1440" w:bottom="1440" w:left="1440" w:header="720" w:footer="720" w:gutter="0"/>
       <w:cols w:space="720"/>

</xml_diff>